<commit_message>
docs: add Word .docx files for Tab Khusus Murid and Tab Khusus Guru
</commit_message>
<xml_diff>
--- a/docs/Tab_1_Khusus_Murid_Catatan_Belajar.docx
+++ b/docs/Tab_1_Khusus_Murid_Catatan_Belajar.docx
@@ -383,42 +383,118 @@
     </w:p>
     <w:p>
       <w:r>
-        <w:t>A. 5 Bilangan Prima Pertama: 2, 3, 5, 7, 11 (Hanya punya 2 faktor: angka 1 dan dirinya sendiri).</w:t>
+        <w:rPr>
+          <w:b/>
+        </w:rPr>
+        <w:t>A. 🌟 Kapsul Pengetahuan: Mengenal Bilangan Prima &amp; Pohon Faktor (Alat Bantu Rahasia)</w:t>
+        <w:br/>
+      </w:r>
+      <w:r>
+        <w:t>• Bilangan Prima: Angka unik yang tidak bisa dipecah lagi (hanya punya 2 faktor: angka 1 dan dirinya sendiri).</w:t>
+        <w:br/>
+      </w:r>
+      <w:r>
+        <w:t xml:space="preserve">  👉 Contoh 4 Prima Pertama: 2, 3, 5, 7</w:t>
+        <w:br/>
+      </w:r>
+      <w:r>
+        <w:t>• Notasi Pangkat Sederhana:</w:t>
+        <w:br/>
+      </w:r>
+      <w:r>
+        <w:t xml:space="preserve">  2³ artinya angka 2 dikalikan 3 kali (2 × 2 × 2 = 8).</w:t>
+        <w:br/>
+      </w:r>
+      <w:r>
+        <w:t xml:space="preserve">  3² artinya angka 3 dikalikan 2 kali (3 × 3 = 9).</w:t>
+        <w:br/>
+      </w:r>
+      <w:r>
+        <w:t>• Aturan Emas Pohon Faktor:</w:t>
+        <w:br/>
+      </w:r>
+      <w:r>
+        <w:t xml:space="preserve">  - KPK (Ambil Semua): Kalikan semua faktor prima, jika sama ambil PANGKAT TERBESAR.</w:t>
+        <w:br/>
+      </w:r>
+      <w:r>
+        <w:t xml:space="preserve">    Contoh: 4 = 2² dan 6 = 2 × 3 ──► KPK = 2² × 3 = 12.</w:t>
+        <w:br/>
+      </w:r>
+      <w:r>
+        <w:t xml:space="preserve">  - FPB (Pilih yang Sama): Hanya pilih faktor prima yang sama, ambil PANGKAT TERKECIL.</w:t>
+        <w:br/>
+      </w:r>
+      <w:r>
+        <w:t xml:space="preserve">    Contoh: 18 = 2 × 3² dan 24 = 2³ × 3 ──► FPB = 2¹ × 3¹ = 6.</w:t>
+        <w:br/>
+      </w:r>
+      <w:r>
+        <w:t xml:space="preserve">  (Pohon faktor adalah alat sakti jika nanti bertemu angka ratusan yang terlalu panjang jika didaftar kelipatannya).</w:t>
         <w:br/>
         <w:br/>
       </w:r>
       <w:r>
-        <w:t>B. Aturan Emas Menentukan FPB &amp; KPK dari Pangkat (Contoh: 24 = 2³ × 3 dan 36 = 2² × 3²):</w:t>
+        <w:rPr>
+          <w:b/>
+        </w:rPr>
+        <w:t>B. 🍕 Penerapan KPK pada Pecahan: 'Sang Pemotong Adil'</w:t>
         <w:br/>
       </w:r>
       <w:r>
-        <w:t>• KPK (Prinsip Rakus / Ambil Semua): Tulis semua faktor prima. Jika ada angka sama, ambil PANGKAT TERBESAR!</w:t>
+        <w:t>• Prinsip Keadilan: Pecahan 1/4 + 1/6 TIDAK BOLEH dijumlahkan jadi 2/10 karena ukuran irisan pizzanya berbeda!</w:t>
         <w:br/>
       </w:r>
       <w:r>
-        <w:t xml:space="preserve">   👉 KPK(24, 36) = 2³ × 3² = 8 × 9 = 72</w:t>
+        <w:t>• KPK dari penyebut (4 dan 6) adalah 12 ──► Kedua pizza dipotong ulang jadi 12 irisan adil:</w:t>
         <w:br/>
       </w:r>
       <w:r>
-        <w:t>• FPB (Prinsip Selektif / Pilih yang Sama): Hanya pilih angka yang sama di keduanya. Ambil PANGKAT TERKECIL!</w:t>
+        <w:t xml:space="preserve">  1/4 = (1 × 3) / (4 × 3) = 3/12</w:t>
         <w:br/>
       </w:r>
       <w:r>
-        <w:t xml:space="preserve">   👉 FPB(24, 36) = 2² × 3 = 4 × 3 = 12</w:t>
+        <w:t xml:space="preserve">  1/6 = (1 × 2) / (6 × 2) = 2/12</w:t>
+        <w:br/>
+      </w:r>
+      <w:r>
+        <w:t>• Operasi Penjumlahan Sah: 3/12 + 2/12 = 5/12 (Penyebut 12 TETAP, tidak ikut dijumlahkan!).</w:t>
         <w:br/>
         <w:br/>
       </w:r>
       <w:r>
-        <w:t>C. Penerapan KPK pada Penjumlahan Pecahan:</w:t>
+        <w:rPr>
+          <w:b/>
+        </w:rPr>
+        <w:t>C. 💎 Penerapan FPB pada Pecahan: 'Sang Penyederhana Ramping'</w:t>
         <w:br/>
       </w:r>
       <w:r>
-        <w:t>• Pecahan 1/4 + 1/6 TIDAK BOLEH langsung dijumlahkan jadi 2/10 karena ukuran irisan pizzanya berbeda!</w:t>
+        <w:t>• FPB digunakan di AKHIR soal ketika hasil pecahan angkanya masih terlalu besar.</w:t>
         <w:br/>
       </w:r>
       <w:r>
-        <w:t>• Gunakan KPK dari penyebut (4 dan 6) yaitu 12 sebagai pemotong adil:</w:t>
+        <w:t>• Contoh Pecahan Raksasa 18/24 ──► Bagi pembilang &amp; penyebut dengan FPB(18, 24) yaitu 6:</w:t>
         <w:br/>
+      </w:r>
+      <w:r>
+        <w:t xml:space="preserve">  (18 ÷ 6) / (24 ÷ 6) = 3/4 (Langsung jadi bentuk paling ramping dalam 1 langkah!).</w:t>
+        <w:br/>
+        <w:br/>
+      </w:r>
+      <w:r>
+        <w:rPr>
+          <w:b/>
+        </w:rPr>
+        <w:t>D. 👑 Peta 2 Langkah Emas Pecahan:</w:t>
+        <w:br/>
+      </w:r>
+      <w:r>
+        <w:t>1. Langkah 1 (Awal Soal): Beda penyebut? ──► Panggil KPK! (Samakan ukuran irisan).</w:t>
+        <w:br/>
+      </w:r>
+      <w:r>
+        <w:t>2. Langkah 2 (Akhir Soal): Angka masih besar? ──► Panggil FPB! (Bagi sampai ramping).</w:t>
       </w:r>
       <w:r>
         <w:t xml:space="preserve">   1/4 + 1/6 = 3/12 + 2/12 = 5/12.</w:t>

</xml_diff>